<commit_message>
Finalize IEEE Access review package
</commit_message>
<xml_diff>
--- a/docs/IEEE_Access_Beyond_RSSI_Carlos_Koo_et_al_REVIEW.docx
+++ b/docs/IEEE_Access_Beyond_RSSI_Carlos_Koo_et_al_REVIEW.docx
@@ -80,8 +80,8 @@
   <dc:title/>
   <dc:creator/>
   <cp:keywords/>
-  <dcterms:created xsi:type="dcterms:W3CDTF">2026-10-01T00:42:59Z</dcterms:created>
-  <dcterms:modified xsi:type="dcterms:W3CDTF">2026-10-01T00:42:59Z</dcterms:modified>
+  <dcterms:created xsi:type="dcterms:W3CDTF">2026-10-01T01:31:42Z</dcterms:created>
+  <dcterms:modified xsi:type="dcterms:W3CDTF">2026-10-01T01:31:42Z</dcterms:modified>
 </cp:coreProperties>
 </file>
 
@@ -96,7 +96,7 @@
 <file path=word\document.xml><?xml version="1.0" encoding="utf-8"?>
 <w:document xmlns:w="http://schemas.openxmlformats.org/wordprocessingml/2006/main" xmlns:m="http://schemas.openxmlformats.org/officeDocument/2006/math" xmlns:r="http://schemas.openxmlformats.org/officeDocument/2006/relationships" xmlns:o="urn:schemas-microsoft-com:office:office" xmlns:v="urn:schemas-microsoft-com:vml" xmlns:w10="urn:schemas-microsoft-com:office:word" xmlns:a="http://schemas.openxmlformats.org/drawingml/2006/main" xmlns:pic="http://schemas.openxmlformats.org/drawingml/2006/picture" xmlns:wp="http://schemas.openxmlformats.org/drawingml/2006/wordprocessingDrawing">
   <w:body>
-    <w:bookmarkStart w:id="84" w:name="_a1ffb343bc4f43c7940538b1278e01cc3a95c97"/>
+    <w:bookmarkStart w:id="85" w:name="_a1ffb343bc4f43c7940538b1278e01cc3a95c97"/>
     <w:p>
       <w:pPr>
         <w:pStyle w:val="Heading1"/>
@@ -156,10 +156,30 @@
         <w:t xml:space="preserve"> </w:t>
       </w:r>
       <w:r>
-        <w:t xml:space="preserve">Carlos J. Koo Labrin (e-mail: [TO BE VERIFIED]).</w:t>
-      </w:r>
-    </w:p>
-    <w:bookmarkStart w:id="34" w:name="_abstract"/>
+        <w:t xml:space="preserve">Carlos J. Koo LabrÃ</w:t>
+      </w:r>
+      <w:r>
+        <w:softHyphen/>
+      </w:r>
+      <w:r>
+        <w:t xml:space="preserve">n (e-mail:</w:t>
+      </w:r>
+      <w:r>
+        <w:t xml:space="preserve"> </w:t>
+      </w:r>
+      <w:hyperlink r:id="rId34">
+        <w:r>
+          <w:rPr>
+            <w:rStyle w:val="Hyperlink"/>
+          </w:rPr>
+          <w:t xml:space="preserve">ckoo@unc.edu.pe</w:t>
+        </w:r>
+      </w:hyperlink>
+      <w:r>
+        <w:t xml:space="preserve">).</w:t>
+      </w:r>
+    </w:p>
+    <w:bookmarkStart w:id="35" w:name="_abstract"/>
     <w:p>
       <w:pPr>
         <w:pStyle w:val="Heading2"/>
@@ -210,8 +230,8 @@
         <w:t xml:space="preserve">link quality; multiscale analysis; point-to-point radio; RSSI; SNR; temporal stability; throughput; wireless link</w:t>
       </w:r>
     </w:p>
-    <w:bookmarkEnd w:id="34"/>
-    <w:bookmarkStart w:id="35" w:name="_e3d0fc0bea9a42ce7605565d0964033d7f6ee47"/>
+    <w:bookmarkEnd w:id="35"/>
+    <w:bookmarkStart w:id="36" w:name="_e3d0fc0bea9a42ce7605565d0964033d7f6ee47"/>
     <w:p>
       <w:pPr>
         <w:pStyle w:val="Heading2"/>
@@ -225,7 +245,7 @@
         <w:pStyle w:val="FirstParagraph"/>
       </w:pPr>
       <w:r>
-        <w:t xml:space="preserve">Long-distance point-to-point wireless links are frequently monitored through a small set of radio indicators, among which received signal strength is one of the most accessible. RSSI is useful for diagnosing gross changes in received power and for verifying link conditions, but a single signal-strength statistic does not necessarily describe the complete operational state of a wireless link. Experimental studies have shown that wireless-link behavior depends on the interaction among signal quality, modulation and coding, traffic conditions, and temporal channel dynamics. For example, measurements of IEEE 802.11ad have evaluated RSSI together with MCS and TCP/UDP throughput rather than treating received signal strength as a complete performance descriptor. [1]</w:t>
+        <w:t xml:space="preserve">Long-distance point-to-point wireless links are frequently monitored through a small set of radio indicators, among which received signal strength is one of the most accessible. RSSI is useful for diagnosing gross changes in received power and for verifying link conditions, but a single signal-strength statistic does not necessarily describe the complete operational state of a wireless link. Experimental studies have shown that wireless-link behavior depends on the interaction among signal quality, modulation and coding, traffic conditions, and temporal channel dynamics. For example, measurements of IEEE 802.11ad have evaluated RSSI together with MCS and TCP/UDP throughput rather than treating received signal strength as a complete performance descriptor. [1] [11]</w:t>
       </w:r>
     </w:p>
     <w:p>
@@ -340,8 +360,8 @@
         <w:t xml:space="preserve">The remainder of the paper is organized as follows. Section 2 reviews previous work on multidimensional wireless-link assessment, temporal stability, and multiscale analysis. Section 3 describes the experimental methodology and statistical procedures. Section 4 presents the results. Section 5 discusses their technical and methodological implications. Section 6 addresses limitations, and Section 7 concludes the study.</w:t>
       </w:r>
     </w:p>
-    <w:bookmarkEnd w:id="35"/>
-    <w:bookmarkStart w:id="41" w:name="_e831035363742a0c7957cffd683edc86db2e5da"/>
+    <w:bookmarkEnd w:id="36"/>
+    <w:bookmarkStart w:id="42" w:name="_e831035363742a0c7957cffd683edc86db2e5da"/>
     <w:p>
       <w:pPr>
         <w:pStyle w:val="Heading2"/>
@@ -350,7 +370,7 @@
         <w:t xml:space="preserve">2. Related Work</w:t>
       </w:r>
     </w:p>
-    <w:bookmarkStart w:id="36" w:name="_f31a93a43a300568954154c4eeabe5515d5a49d"/>
+    <w:bookmarkStart w:id="37" w:name="_f31a93a43a300568954154c4eeabe5515d5a49d"/>
     <w:p>
       <w:pPr>
         <w:pStyle w:val="Heading3"/>
@@ -364,7 +384,7 @@
         <w:pStyle w:val="FirstParagraph"/>
       </w:pPr>
       <w:r>
-        <w:t xml:space="preserve">RSSI and related received-signal indicators are widely used because they provide a direct operational measure of received power. However, their relationship with actual data performance depends on the radio technology, interference environment, modulation/coding state, bandwidth, and traffic conditions. Experimental evaluation of IEEE 802.11ad, for example, has explicitly combined RSSI measurements with different MCS configurations and TCP/UDP throughput measurements, illustrating the need to connect signal conditions with delivered performance. [1]</w:t>
+        <w:t xml:space="preserve">RSSI and related received-signal indicators are widely used because they provide a direct operational measure of received power. However, their relationship with actual data performance depends on the radio technology, interference environment, modulation/coding state, bandwidth, and traffic conditions. Experimental evaluation of IEEE 802.11ad, for example, has explicitly combined RSSI measurements with different MCS configurations and TCP/UDP throughput measurements, illustrating the need to connect signal conditions with delivered performance. [1] [11]</w:t>
       </w:r>
     </w:p>
     <w:p>
@@ -375,8 +395,8 @@
         <w:t xml:space="preserve">The distinction between signal strength and data performance is also reflected in wireless-network modeling approaches in which RSSI is used as one input to estimate data-rate potential while MCS, channel bandwidth, coding, and spatial streams contribute to the resulting physical rate. [6] These studies support a multidimensional interpretation of radio-link performance, but they do not by themselves address the temporal stability framework used in the present field experiment.</w:t>
       </w:r>
     </w:p>
-    <w:bookmarkEnd w:id="36"/>
-    <w:bookmarkStart w:id="37" w:name="_6913d2f45845a91535d62ec743966fe19b90c3b"/>
+    <w:bookmarkEnd w:id="37"/>
+    <w:bookmarkStart w:id="38" w:name="_6913d2f45845a91535d62ec743966fe19b90c3b"/>
     <w:p>
       <w:pPr>
         <w:pStyle w:val="Heading3"/>
@@ -401,8 +421,8 @@
         <w:t xml:space="preserve">The present study extends this perspective in a different direction. Rather than estimating throughput from a theoretical PHY-rate model or evaluating isolated signal-quality conditions, it uses measured field telemetry and compares the empirical distributions of RSSI, SNR, MCS, and observed throughput across sustained operating configurations.</w:t>
       </w:r>
     </w:p>
-    <w:bookmarkEnd w:id="37"/>
-    <w:bookmarkStart w:id="38" w:name="_211eb5747599e8010d1b6e8c5a100d04ce770c0"/>
+    <w:bookmarkEnd w:id="38"/>
+    <w:bookmarkStart w:id="39" w:name="_211eb5747599e8010d1b6e8c5a100d04ce770c0"/>
     <w:p>
       <w:pPr>
         <w:pStyle w:val="Heading3"/>
@@ -435,8 +455,8 @@
         <w:t xml:space="preserve">These studies establish the importance of temporal behavior but generally address different technologies, mobility conditions, network layers, or objectives. The present work focuses specifically on a long-distance fixed point-to-point link and treats temporal variability as an explicit dimension of configuration assessment.</w:t>
       </w:r>
     </w:p>
-    <w:bookmarkEnd w:id="38"/>
-    <w:bookmarkStart w:id="39" w:name="_e09b9c8e93384e21a8a7d3b25757870f4319ab1"/>
+    <w:bookmarkEnd w:id="39"/>
+    <w:bookmarkStart w:id="40" w:name="_e09b9c8e93384e21a8a7d3b25757870f4319ab1"/>
     <w:p>
       <w:pPr>
         <w:pStyle w:val="Heading3"/>
@@ -469,8 +489,8 @@
         <w:t xml:space="preserve">The present study uses this principle as a sensitivity analysis rather than as a predictive model. MTRA does not attempt to forecast future link states or infer a universal temporal scale. Instead, it asks whether configuration-associated differences detected in the field telemetry remain statistically detectable at three predefined temporal resolutions.</w:t>
       </w:r>
     </w:p>
-    <w:bookmarkEnd w:id="39"/>
-    <w:bookmarkStart w:id="40" w:name="_9f7d638f104a121180661c4c8fbed367eeb7639"/>
+    <w:bookmarkEnd w:id="40"/>
+    <w:bookmarkStart w:id="41" w:name="_9f7d638f104a121180661c4c8fbed367eeb7639"/>
     <w:p>
       <w:pPr>
         <w:pStyle w:val="Heading3"/>
@@ -503,9 +523,9 @@
         <w:t xml:space="preserve">This framing deliberately avoids claiming methodological priority for MTRA or novelty for the individual statistical tests. The contribution lies in the experimental integration and evidence structure applied to the specific problem of configuration-dependent long-distance radio-link assessment.</w:t>
       </w:r>
     </w:p>
-    <w:bookmarkEnd w:id="40"/>
     <w:bookmarkEnd w:id="41"/>
-    <w:bookmarkStart w:id="51" w:name="_167a2da0345881bf36eef0606d50b1063a572d3"/>
+    <w:bookmarkEnd w:id="42"/>
+    <w:bookmarkStart w:id="52" w:name="_167a2da0345881bf36eef0606d50b1063a572d3"/>
     <w:p>
       <w:pPr>
         <w:pStyle w:val="Heading2"/>
@@ -514,7 +534,7 @@
         <w:t xml:space="preserve">3. Methods</w:t>
       </w:r>
     </w:p>
-    <w:bookmarkStart w:id="42" w:name="_46ade2af64a8d75833171cdbb832ace8f65c7fc"/>
+    <w:bookmarkStart w:id="43" w:name="_46ade2af64a8d75833171cdbb832ace8f65c7fc"/>
     <w:p>
       <w:pPr>
         <w:pStyle w:val="Heading3"/>
@@ -528,7 +548,7 @@
         <w:pStyle w:val="FirstParagraph"/>
       </w:pPr>
       <w:r>
-        <w:t xml:space="preserve">The study used a sequential field-experiment design for a long-distance point-to-point wireless link deployed in a rural high-Andean environment in Cajamarca, Peru. The experimental factor was the radio configuration, represented by the operating frequency and channel bandwidth. The route, radio equipment, antennas, alignment, and infrastructure were maintained constant to the extent operationally possible while the configuration was changed sequentially.</w:t>
+        <w:t xml:space="preserve">The study used a sequential field-experiment design for a long-distance point-to-point wireless link deployed in a rural high-Andean environment in Cajamarca, Peru. The experimental factor was the radio configuration, represented by the operating frequency and channel bandwidth. The route, radio equipment, antennas, alignment, and infrastructure were maintained constant to the extent operationally possible while the configuration was changed sequentially. [11]</w:t>
       </w:r>
     </w:p>
     <w:p>
@@ -547,8 +567,8 @@
         <w:t xml:space="preserve">The experimental records cover the following observation windows in the versioned raw dataset: E0, 19-28 February 2026; E1, 2-11 April 2026; E2, 12-21 April 2026; E3, 3-12 May 2026; E4, 13-22 May 2026; and E5, 23 May-2 June 2026. The number of usable records is not identical across scenarios because the analysis retained the observations available after the documented data-cleaning and validity procedures. The descriptive dataset contains 14,400 records for E0, 2,760 for E1, 2,245 for E2, 2,381 for E3, 2,184 for E4, and 2,137 for E5.</w:t>
       </w:r>
     </w:p>
-    <w:bookmarkEnd w:id="42"/>
-    <w:bookmarkStart w:id="43" w:name="_7fde26a706d072cd2b89d18fd6f7cd6686115e2"/>
+    <w:bookmarkEnd w:id="43"/>
+    <w:bookmarkStart w:id="44" w:name="_7fde26a706d072cd2b89d18fd6f7cd6686115e2"/>
     <w:p>
       <w:pPr>
         <w:pStyle w:val="Heading3"/>
@@ -929,8 +949,8 @@
         <w:t xml:space="preserve">The configuration assignment and scenario metadata are defined in the repository configuration file and are used by the consolidation pipeline to normalize the raw observations.</w:t>
       </w:r>
     </w:p>
-    <w:bookmarkEnd w:id="43"/>
-    <w:bookmarkStart w:id="44" w:name="_424f65b403f9cf81aebf92f043b60f36f764f2c"/>
+    <w:bookmarkEnd w:id="44"/>
+    <w:bookmarkStart w:id="45" w:name="_424f65b403f9cf81aebf92f043b60f36f764f2c"/>
     <w:p>
       <w:pPr>
         <w:pStyle w:val="Heading3"/>
@@ -963,8 +983,8 @@
         <w:t xml:space="preserve">ERA5-Land and NASA POWER are deliberately excluded from the publication analysis. They remain in the research repository as part of the original experimental project but are not used as evidence in the Beyond RSSI manuscript.</w:t>
       </w:r>
     </w:p>
-    <w:bookmarkEnd w:id="44"/>
-    <w:bookmarkStart w:id="45" w:name="_26496b4f2a24071092b88af8a0c3e1a6cf1e26a"/>
+    <w:bookmarkEnd w:id="45"/>
+    <w:bookmarkStart w:id="46" w:name="_26496b4f2a24071092b88af8a0c3e1a6cf1e26a"/>
     <w:p>
       <w:pPr>
         <w:pStyle w:val="Heading3"/>
@@ -997,8 +1017,8 @@
         <w:t xml:space="preserve">The resulting scenario dataset was organized around timestamp, scenario identifier, frequency, channel bandwidth, RSSI DL, SNR DL, MCS DL, and observed throughput DL. E0 does not contain an observed-throughput measurement compatible with the E1-E5 throughput series; consequently, E0 is excluded from throughput comparisons but remains included in RSSI, SNR, and MCS analyses.</w:t>
       </w:r>
     </w:p>
-    <w:bookmarkEnd w:id="45"/>
-    <w:bookmarkStart w:id="46" w:name="_1f77db86fc7a33d9e0e23a5a9841953aba12137"/>
+    <w:bookmarkEnd w:id="46"/>
+    <w:bookmarkStart w:id="47" w:name="_1f77db86fc7a33d9e0e23a5a9841953aba12137"/>
     <w:p>
       <w:pPr>
         <w:pStyle w:val="Heading3"/>
@@ -1095,8 +1115,8 @@
         <w:t xml:space="preserve">The statistical workflow and the corresponding evidence tables are versioned in the repository.</w:t>
       </w:r>
     </w:p>
-    <w:bookmarkEnd w:id="46"/>
-    <w:bookmarkStart w:id="47" w:name="_28614f9c6a60b4a957ceead2f5aaf4cbaac8178"/>
+    <w:bookmarkEnd w:id="47"/>
+    <w:bookmarkStart w:id="48" w:name="_28614f9c6a60b4a957ceead2f5aaf4cbaac8178"/>
     <w:p>
       <w:pPr>
         <w:pStyle w:val="Heading3"/>
@@ -1129,8 +1149,8 @@
         <w:t xml:space="preserve">The resulting index is explicitly comparative within the evaluated dataset; it is not intended to represent a universal or externally calibrated scale. Because observed throughput is unavailable for E0, the four-component composite index is directly comparable only across E1-E5. E0 remains available for the signal-only stability descriptors.</w:t>
       </w:r>
     </w:p>
-    <w:bookmarkEnd w:id="47"/>
-    <w:bookmarkStart w:id="48" w:name="_85a4d2984a7a3bab25bb6d7342f06616289f902"/>
+    <w:bookmarkEnd w:id="48"/>
+    <w:bookmarkStart w:id="49" w:name="_85a4d2984a7a3bab25bb6d7342f06616289f902"/>
     <w:p>
       <w:pPr>
         <w:pStyle w:val="Heading3"/>
@@ -1175,8 +1195,8 @@
         <w:t xml:space="preserve">.</w:t>
       </w:r>
     </w:p>
-    <w:bookmarkEnd w:id="48"/>
-    <w:bookmarkStart w:id="49" w:name="_b8ca529729bc5fb8428c9df3a1dbaf4f669db3e"/>
+    <w:bookmarkEnd w:id="49"/>
+    <w:bookmarkStart w:id="50" w:name="_b8ca529729bc5fb8428c9df3a1dbaf4f669db3e"/>
     <w:p>
       <w:pPr>
         <w:pStyle w:val="Heading3"/>
@@ -1263,8 +1283,8 @@
         <w:t xml:space="preserve">The reproducibility level of the current publication extension is output-reproducible: the versioned figures and MTRA evidence table can be reconstructed exactly from the frozen statistical values. Full analytical reproducibility additionally depends on auditing and executing the upstream thesis statistical pipeline.</w:t>
       </w:r>
     </w:p>
-    <w:bookmarkEnd w:id="49"/>
-    <w:bookmarkStart w:id="50" w:name="_b13ea81f32dcb088fd0f583aae6d2e7ed2ae02e"/>
+    <w:bookmarkEnd w:id="50"/>
+    <w:bookmarkStart w:id="51" w:name="_b13ea81f32dcb088fd0f583aae6d2e7ed2ae02e"/>
     <w:p>
       <w:pPr>
         <w:pStyle w:val="Heading3"/>
@@ -1289,9 +1309,9 @@
         <w:t xml:space="preserve">The sequential field design also means that the scenarios were observed during different calendar periods. The manuscript therefore reports configuration-associated differences and temporal robustness rather than claiming that the experimental data isolate frequency or bandwidth as independent causal factors under all environmental and operational conditions.</w:t>
       </w:r>
     </w:p>
-    <w:bookmarkEnd w:id="50"/>
     <w:bookmarkEnd w:id="51"/>
-    <w:bookmarkStart w:id="68" w:name="_121719332867ee227f0a04b486098cee978c6e6"/>
+    <w:bookmarkEnd w:id="52"/>
+    <w:bookmarkStart w:id="69" w:name="_121719332867ee227f0a04b486098cee978c6e6"/>
     <w:p>
       <w:pPr>
         <w:pStyle w:val="Heading2"/>
@@ -1300,7 +1320,7 @@
         <w:t xml:space="preserve">4. Results</w:t>
       </w:r>
     </w:p>
-    <w:bookmarkStart w:id="55" w:name="_bd09d764cfd44d3964de8ac14f43b7b97ce793e"/>
+    <w:bookmarkStart w:id="56" w:name="_bd09d764cfd44d3964de8ac14f43b7b97ce793e"/>
     <w:p>
       <w:pPr>
         <w:pStyle w:val="Heading3"/>
@@ -1314,7 +1334,7 @@
         <w:pStyle w:val="FirstParagraph"/>
       </w:pPr>
       <w:r>
-        <w:t xml:space="preserve">The descriptive results show measurable differences among the six radio configurations across RSSI DL, SNR DL, and MCS DL. The corresponding configuration profiles are summarized in Fig. 2.</w:t>
+        <w:t xml:space="preserve">The descriptive results show measurable differences among the six radio configurations across RSSI DL, SNR DL, and MCS DL. The corresponding configuration profiles are summarized in Fig. 2. [11]</w:t>
       </w:r>
     </w:p>
     <w:p>
@@ -1326,18 +1346,18 @@
           <wp:inline>
             <wp:extent cx="6375400" cy="4098471"/>
             <wp:effectExtent b="0" l="0" r="0" t="0"/>
-            <wp:docPr descr="Fig. 2. Configuration-dependent performance profiles." title="" id="53" name="Picture"/>
+            <wp:docPr descr="Fig. 2. Configuration-dependent performance profiles." title="" id="54" name="Picture"/>
             <a:graphic>
               <a:graphicData uri="http://schemas.openxmlformats.org/drawingml/2006/picture">
                 <pic:pic>
                   <pic:nvPicPr>
-                    <pic:cNvPr descr="../outputs/article_figures/Fig02_configuration_profiles.png" id="54" name="Picture"/>
+                    <pic:cNvPr descr="../outputs/article_figures/Fig02_configuration_profiles.png" id="55" name="Picture"/>
                     <pic:cNvPicPr>
                       <a:picLocks noChangeArrowheads="1" noChangeAspect="1"/>
                     </pic:cNvPicPr>
                   </pic:nvPicPr>
                   <pic:blipFill>
-                    <a:blip r:embed="rId52"/>
+                    <a:blip r:embed="rId53"/>
                     <a:stretch>
                       <a:fillRect/>
                     </a:stretch>
@@ -1394,8 +1414,8 @@
         <w:t xml:space="preserve">These results indicate that the measured performance distributions differed across the tested configurations. Because the scenarios were evaluated sequentially during different calendar periods, the results are reported as configuration-associated differences rather than as a universal causal effect attributable exclusively to frequency or bandwidth.</w:t>
       </w:r>
     </w:p>
-    <w:bookmarkEnd w:id="55"/>
-    <w:bookmarkStart w:id="59" w:name="_58edcd516498add1ea0879d2aff3c834607b7ae"/>
+    <w:bookmarkEnd w:id="56"/>
+    <w:bookmarkStart w:id="60" w:name="_58edcd516498add1ea0879d2aff3c834607b7ae"/>
     <w:p>
       <w:pPr>
         <w:pStyle w:val="Heading3"/>
@@ -1437,18 +1457,18 @@
           <wp:inline>
             <wp:extent cx="6375400" cy="4098471"/>
             <wp:effectExtent b="0" l="0" r="0" t="0"/>
-            <wp:docPr descr="Fig. 3. Mean performance and temporal variability across the evaluated configurations." title="" id="57" name="Picture"/>
+            <wp:docPr descr="Fig. 3. Mean performance and temporal variability across the evaluated configurations." title="" id="58" name="Picture"/>
             <a:graphic>
               <a:graphicData uri="http://schemas.openxmlformats.org/drawingml/2006/picture">
                 <pic:pic>
                   <pic:nvPicPr>
-                    <pic:cNvPr descr="../outputs/article_figures/Fig03_performance_stability.png" id="58" name="Picture"/>
+                    <pic:cNvPr descr="../outputs/article_figures/Fig03_performance_stability.png" id="59" name="Picture"/>
                     <pic:cNvPicPr>
                       <a:picLocks noChangeArrowheads="1" noChangeAspect="1"/>
                     </pic:cNvPicPr>
                   </pic:nvPicPr>
                   <pic:blipFill>
-                    <a:blip r:embed="rId56"/>
+                    <a:blip r:embed="rId57"/>
                     <a:stretch>
                       <a:fillRect/>
                     </a:stretch>
@@ -1489,8 +1509,8 @@
         <w:t xml:space="preserve">The stability analysis provides information not captured by mean performance alone. The scenario with the largest mean throughput is not necessarily the scenario with the smallest relative variability, supporting the analysis of central tendency and stability as separate dimensions.</w:t>
       </w:r>
     </w:p>
-    <w:bookmarkEnd w:id="59"/>
-    <w:bookmarkStart w:id="66" w:name="_61340887d8c74ef6f3cca108cfb5c4fac47175e"/>
+    <w:bookmarkEnd w:id="60"/>
+    <w:bookmarkStart w:id="67" w:name="_61340887d8c74ef6f3cca108cfb5c4fac47175e"/>
     <w:p>
       <w:pPr>
         <w:pStyle w:val="Heading3"/>
@@ -1516,18 +1536,18 @@
           <wp:inline>
             <wp:extent cx="6375400" cy="4098471"/>
             <wp:effectExtent b="0" l="0" r="0" t="0"/>
-            <wp:docPr descr="Fig. 4. MTRA effect sizes across 15-, 30-, and 60-minute aggregation scales." title="" id="61" name="Picture"/>
+            <wp:docPr descr="Fig. 4. MTRA effect sizes across 15-, 30-, and 60-minute aggregation scales." title="" id="62" name="Picture"/>
             <a:graphic>
               <a:graphicData uri="http://schemas.openxmlformats.org/drawingml/2006/picture">
                 <pic:pic>
                   <pic:nvPicPr>
-                    <pic:cNvPr descr="../outputs/article_figures/Fig04_MTRA_effect_sizes.png" id="62" name="Picture"/>
+                    <pic:cNvPr descr="../outputs/article_figures/Fig04_MTRA_effect_sizes.png" id="63" name="Picture"/>
                     <pic:cNvPicPr>
                       <a:picLocks noChangeArrowheads="1" noChangeAspect="1"/>
                     </pic:cNvPicPr>
                   </pic:nvPicPr>
                   <pic:blipFill>
-                    <a:blip r:embed="rId60"/>
+                    <a:blip r:embed="rId61"/>
                     <a:stretch>
                       <a:fillRect/>
                     </a:stretch>
@@ -1563,18 +1583,18 @@
           <wp:inline>
             <wp:extent cx="6375400" cy="4098471"/>
             <wp:effectExtent b="0" l="0" r="0" t="0"/>
-            <wp:docPr descr="Fig. 5. Metric-specific stability across temporal aggregation scales." title="" id="64" name="Picture"/>
+            <wp:docPr descr="Fig. 5. Metric-specific stability across temporal aggregation scales." title="" id="65" name="Picture"/>
             <a:graphic>
               <a:graphicData uri="http://schemas.openxmlformats.org/drawingml/2006/picture">
                 <pic:pic>
                   <pic:nvPicPr>
-                    <pic:cNvPr descr="../outputs/article_figures/Fig05_stability_scales.png" id="65" name="Picture"/>
+                    <pic:cNvPr descr="../outputs/article_figures/Fig05_stability_scales.png" id="66" name="Picture"/>
                     <pic:cNvPicPr>
                       <a:picLocks noChangeArrowheads="1" noChangeAspect="1"/>
                     </pic:cNvPicPr>
                   </pic:nvPicPr>
                   <pic:blipFill>
-                    <a:blip r:embed="rId63"/>
+                    <a:blip r:embed="rId64"/>
                     <a:stretch>
                       <a:fillRect/>
                     </a:stretch>
@@ -1641,8 +1661,8 @@
         <w:t xml:space="preserve">The MTRA results show that configuration-associated differences detected in the raw telemetry remain detectable after aggregation at all three evaluated temporal scales. MTRA is interpreted as a temporal sensitivity assessment, not as evidence that one temporal resolution is intrinsically superior.</w:t>
       </w:r>
     </w:p>
-    <w:bookmarkEnd w:id="66"/>
-    <w:bookmarkStart w:id="67" w:name="_0b4bd8d282b8494dc444cc4350072dbfd8d56b6"/>
+    <w:bookmarkEnd w:id="67"/>
+    <w:bookmarkStart w:id="68" w:name="_0b4bd8d282b8494dc444cc4350072dbfd8d56b6"/>
     <w:p>
       <w:pPr>
         <w:pStyle w:val="Heading3"/>
@@ -1667,9 +1687,9 @@
         <w:t xml:space="preserve">Publication figures are Fig. 2 configuration-dependent performance profiles, Fig. 3 mean performance versus temporal variability, Fig. 4 MTRA effect sizes, and Fig. 5 metric-specific stability across temporal scales.</w:t>
       </w:r>
     </w:p>
-    <w:bookmarkEnd w:id="67"/>
     <w:bookmarkEnd w:id="68"/>
-    <w:bookmarkStart w:id="74" w:name="_735612638e4e736e4693e459c258977262c0dfc"/>
+    <w:bookmarkEnd w:id="69"/>
+    <w:bookmarkStart w:id="75" w:name="_735612638e4e736e4693e459c258977262c0dfc"/>
     <w:p>
       <w:pPr>
         <w:pStyle w:val="Heading2"/>
@@ -1678,7 +1698,7 @@
         <w:t xml:space="preserve">5. Discussion</w:t>
       </w:r>
     </w:p>
-    <w:bookmarkStart w:id="69" w:name="_201d132a5763d174a1ebb466cfe0f6a6e2e5d80"/>
+    <w:bookmarkStart w:id="70" w:name="_201d132a5763d174a1ebb466cfe0f6a6e2e5d80"/>
     <w:p>
       <w:pPr>
         <w:pStyle w:val="Heading3"/>
@@ -1692,7 +1712,7 @@
         <w:pStyle w:val="FirstParagraph"/>
       </w:pPr>
       <w:r>
-        <w:t xml:space="preserve">The results show that changing the radio configuration was associated with differences not only in received signal level but also in SNR, MCS, and observed throughput. The Kruskal-Wallis results and epsilon-squared values indicate that the scenario distributions were not interchangeable within the experimental dataset.</w:t>
+        <w:t xml:space="preserve">The results show that changing the radio configuration was associated with differences not only in received signal level but also in SNR, MCS, and observed throughput. The Kruskal-Wallis results and epsilon-squared values indicate that the scenario distributions were not interchangeable within the experimental dataset. [11]</w:t>
       </w:r>
     </w:p>
     <w:p>
@@ -1711,8 +1731,8 @@
         <w:t xml:space="preserve">The result supports the central motivation of a beyond-RSSI analysis: a configuration can exhibit favorable signal-level statistics while presenting a different behavior in link adaptation and measured throughput. RSSI should therefore be interpreted as one component of a multidimensional performance state rather than as a sufficient proxy for end-to-end radio-link performance.</w:t>
       </w:r>
     </w:p>
-    <w:bookmarkEnd w:id="69"/>
-    <w:bookmarkStart w:id="70" w:name="_09f6c655d603c520ba122e670e58f4a33a7b190"/>
+    <w:bookmarkEnd w:id="70"/>
+    <w:bookmarkStart w:id="71" w:name="_09f6c655d603c520ba122e670e58f4a33a7b190"/>
     <w:p>
       <w:pPr>
         <w:pStyle w:val="Heading3"/>
@@ -1737,8 +1757,8 @@
         <w:t xml:space="preserve">The contrast between E2 and E4 is particularly relevant. E2 had the highest mean RSSI and SNR, but E4 had the highest observed throughput mean. This prevents a one-dimensional interpretation in which the configuration with the strongest received signal necessarily provides the highest measured throughput. The evidence instead supports joint inspection of received power, signal quality, modulation/coding state, and throughput.</w:t>
       </w:r>
     </w:p>
-    <w:bookmarkEnd w:id="70"/>
-    <w:bookmarkStart w:id="71" w:name="_47c06bd8b1b4c2839a40afb142811868babcbdf"/>
+    <w:bookmarkEnd w:id="71"/>
+    <w:bookmarkStart w:id="72" w:name="_47c06bd8b1b4c2839a40afb142811868babcbdf"/>
     <w:p>
       <w:pPr>
         <w:pStyle w:val="Heading3"/>
@@ -1771,8 +1791,8 @@
         <w:t xml:space="preserve">Within E1-E5, the index values range from 0.2302 to 0.9120. This spread demonstrates that configurations can occupy substantially different regions of the variability space. The practical implication is that configuration assessment should consider central tendency and stability as separate dimensions.</w:t>
       </w:r>
     </w:p>
-    <w:bookmarkEnd w:id="71"/>
-    <w:bookmarkStart w:id="72" w:name="_f7a5ef7c6e02f5442af2509c6cbc914b404b021"/>
+    <w:bookmarkEnd w:id="72"/>
+    <w:bookmarkStart w:id="73" w:name="_f7a5ef7c6e02f5442af2509c6cbc914b404b021"/>
     <w:p>
       <w:pPr>
         <w:pStyle w:val="Heading3"/>
@@ -1805,8 +1825,8 @@
         <w:t xml:space="preserve">MTRA should nevertheless be interpreted as a sensitivity analysis rather than as evidence that longer aggregation windows are intrinsically preferable. Aggregation changes temporal granularity and the number of observations and can alter variance and effect-size estimates. Its value here is that the main configuration differences remain detectable under three predefined temporal resolutions.</w:t>
       </w:r>
     </w:p>
-    <w:bookmarkEnd w:id="72"/>
-    <w:bookmarkStart w:id="73" w:name="_9ea4bb26fb14e757428917545d0316a23bae31d"/>
+    <w:bookmarkEnd w:id="73"/>
+    <w:bookmarkStart w:id="74" w:name="_9ea4bb26fb14e757428917545d0316a23bae31d"/>
     <w:p>
       <w:pPr>
         <w:pStyle w:val="Heading3"/>
@@ -1839,9 +1859,9 @@
         <w:t xml:space="preserve">The repository implementation reinforces this methodological contribution because the statistical evidence, figures, and analysis definitions are versioned as a connected artifact. This allows the reported results to be traced from scenario-level data products to publication figures.</w:t>
       </w:r>
     </w:p>
-    <w:bookmarkEnd w:id="73"/>
     <w:bookmarkEnd w:id="74"/>
-    <w:bookmarkStart w:id="76" w:name="_07495bb7d7ff3c50206f872d4766169330a61ca"/>
+    <w:bookmarkEnd w:id="75"/>
+    <w:bookmarkStart w:id="77" w:name="_07495bb7d7ff3c50206f872d4766169330a61ca"/>
     <w:p>
       <w:pPr>
         <w:pStyle w:val="Heading2"/>
@@ -1855,7 +1875,7 @@
         <w:pStyle w:val="FirstParagraph"/>
       </w:pPr>
       <w:r>
-        <w:t xml:space="preserve">Several limitations delimit the interpretation of the findings.</w:t>
+        <w:t xml:space="preserve">Several limitations delimit the interpretation of the findings. [11]</w:t>
       </w:r>
     </w:p>
     <w:p>
@@ -1898,7 +1918,7 @@
         <w:t xml:space="preserve">Finally, the current publication branch reproduces the frozen statistical outputs used to generate the article figures, but the publication generator itself does not independently recompute every upstream statistical test from raw observations. Full analytical reproducibility therefore depends on the upstream thesis pipeline and its audit. This distinction is documented in the repository and should remain visible in the final manuscript.</w:t>
       </w:r>
     </w:p>
-    <w:bookmarkStart w:id="75" w:name="_871b5eb25bcbba71b3605770c3b1dd5f0f39b3b"/>
+    <w:bookmarkStart w:id="76" w:name="_871b5eb25bcbba71b3605770c3b1dd5f0f39b3b"/>
     <w:p>
       <w:pPr>
         <w:pStyle w:val="Heading3"/>
@@ -1923,9 +1943,9 @@
         <w:t xml:space="preserve">These extensions define the experimental steps needed to distinguish more strongly between configuration effects and time-varying field conditions.</w:t>
       </w:r>
     </w:p>
-    <w:bookmarkEnd w:id="75"/>
     <w:bookmarkEnd w:id="76"/>
-    <w:bookmarkStart w:id="77" w:name="_5ad5eaf6d0c1ea78b88e71f1132e55733b7beb7"/>
+    <w:bookmarkEnd w:id="77"/>
+    <w:bookmarkStart w:id="78" w:name="_5ad5eaf6d0c1ea78b88e71f1132e55733b7beb7"/>
     <w:p>
       <w:pPr>
         <w:pStyle w:val="Heading2"/>
@@ -1939,7 +1959,7 @@
         <w:pStyle w:val="FirstParagraph"/>
       </w:pPr>
       <w:r>
-        <w:t xml:space="preserve">This study evaluated a long-distance point-to-point wireless link using a multidimensional and multiscale experimental framework. Six frequency-bandwidth configurations were compared using RSSI, SNR, MCS, and observed throughput, complemented by temporal variability and multiscale sensitivity analysis.</w:t>
+        <w:t xml:space="preserve">This study evaluated a long-distance point-to-point wireless link using a multidimensional and multiscale experimental framework. Six frequency-bandwidth configurations were compared using RSSI, SNR, MCS, and observed throughput, complemented by temporal variability and multiscale sensitivity analysis. [11]</w:t>
       </w:r>
     </w:p>
     <w:p>
@@ -1982,8 +2002,8 @@
         <w:t xml:space="preserve">Future work should alternate configurations within shorter controlled blocks, replicate the experiment across additional links and propagation environments, and acquire synchronized throughput measurements for every configuration, including the baseline.</w:t>
       </w:r>
     </w:p>
-    <w:bookmarkEnd w:id="77"/>
-    <w:bookmarkStart w:id="79" w:name="_333578fc3e8634b78411490a6e2088ad81144c1"/>
+    <w:bookmarkEnd w:id="78"/>
+    <w:bookmarkStart w:id="80" w:name="_333578fc3e8634b78411490a6e2088ad81144c1"/>
     <w:p>
       <w:pPr>
         <w:pStyle w:val="Heading2"/>
@@ -2002,7 +2022,7 @@
       <w:r>
         <w:t xml:space="preserve"> </w:t>
       </w:r>
-      <w:hyperlink r:id="rId78">
+      <w:hyperlink r:id="rId79">
         <w:r>
           <w:rPr>
             <w:rStyle w:val="Hyperlink"/>
@@ -2014,8 +2034,8 @@
         <w:t xml:space="preserve">. The repository contains the scenario organization, processing scripts, statistical outputs, publication figures, evidence matrix, and reproducibility documentation. The publication extension is maintained in the article/beyond-rssi branch.</w:t>
       </w:r>
     </w:p>
-    <w:bookmarkEnd w:id="79"/>
-    <w:bookmarkStart w:id="80" w:name="_acknowledgment"/>
+    <w:bookmarkEnd w:id="80"/>
+    <w:bookmarkStart w:id="81" w:name="_acknowledgment"/>
     <w:p>
       <w:pPr>
         <w:pStyle w:val="Heading2"/>
@@ -2029,11 +2049,11 @@
         <w:pStyle w:val="FirstParagraph"/>
       </w:pPr>
       <w:r>
-        <w:t xml:space="preserve">OpenAI ChatGPT was used for language organization, synthesis, and editorial assistance during preparation of Sections 1–7 of this manuscript [11]. AI assistance was not used to generate the quantitative results, statistical values, experimental measurements, or repository evidence. Those elements were derived from the project’s versioned research artifacts. The authors verified the scientific content, citations, authorship, and submission materials.</w:t>
-      </w:r>
-    </w:p>
-    <w:bookmarkEnd w:id="80"/>
-    <w:bookmarkStart w:id="82" w:name="_references"/>
+        <w:t xml:space="preserve">ChatGPT (OpenAI) was used during preparation of Sections 1â€“7 for language organization, synthesis, and editorial assistance. The affected sections contain a citation to the AI system [11]. AI assistance was not used to generate the quantitative results, statistical values, experimental measurements, or repository evidence. Those elements were derived from the projectâ€™s versioned research artifacts. The authors verified the scientific content, citations, authorship, and submission materials.</w:t>
+      </w:r>
+    </w:p>
+    <w:bookmarkEnd w:id="81"/>
+    <w:bookmarkStart w:id="83" w:name="_references"/>
     <w:p>
       <w:pPr>
         <w:pStyle w:val="Heading2"/>
@@ -2087,7 +2107,31 @@
         <w:pStyle w:val="BodyText"/>
       </w:pPr>
       <w:r>
-        <w:t xml:space="preserve">[6] J. Mao, Y. Zhao, and Y. Xia, "Revisiting Link Quality Metrics and Models for Multichannel Low-Power Lossy Networks," Sensors, vol. 23, no. 3, p. 1303, 2023, doi: 10.3390/s23031303.</w:t>
+        <w:t xml:space="preserve">[6] J. Mao, Y. Zhao, Y. Xia, Z. Yang, C. Xu, W. Liu, and D. Huang, "Revisiting Link Quality Metrics and Models for Multichannel Low-Power Lossy Networks," Sensors, vol. 23, no. 3, Art. no. 1303, 2023, doi: 10.3390/s23031303.</w:t>
+      </w:r>
+      <w:r>
+        <w:t xml:space="preserve"> </w:t>
+      </w:r>
+      <w:r>
+        <w:t xml:space="preserve">[7] A. Vlavianos, L. K. Law, I. Broustis, S. V. Krishnamurthy, and M. Faloutsos, "Assessing Link Quality in IEEE 802.11 Wireless Networks: Which Is the Right Metric?" in Proc. IEEE 19th Int. Symp. Personal, Indoor and Mobile Radio Communications (PIMRC), 2008, pp. 1â€“6, doi: 10.1109/PIMRC.2008.4699837.</w:t>
+      </w:r>
+      <w:r>
+        <w:t xml:space="preserve"> </w:t>
+      </w:r>
+      <w:r>
+        <w:t xml:space="preserve">[8] W. Liu, Y. Xia, J. Xu, S. Hu, and R. Luo, "Revisiting Link Quality Metrics for Wireless Sensor Networks," in Proc. 2019 IEEE 5th Int. Conf. Computer and Communications (ICCC), 2019, pp. 597â€“602, doi: 10.1109/ICCC47050.2019.9064098.</w:t>
+      </w:r>
+      <w:r>
+        <w:t xml:space="preserve"> </w:t>
+      </w:r>
+      <w:r>
+        <w:t xml:space="preserve">[9] J. Xu, Y. Xia, J. Xie, W. Liu, R. Luo, S. Hu, and D. Huang, "Faster or Slower: Convergence of Link Quality Metrics in Wireless Sensor Networks," in Proc. 2020 IEEE 6th Int. Conf. Computer and Communications (ICCC), 2020, pp. 357â€“362, doi: 10.1109/ICCC51575.2020.9345076.</w:t>
+      </w:r>
+      <w:r>
+        <w:t xml:space="preserve"> </w:t>
+      </w:r>
+      <w:r>
+        <w:t xml:space="preserve">[10] J. Dong and W.-J. Kim, "Experimental Analysis and Implementation of a Multiscale Wireless/Wired Networked Control System," International Journal of Control, Automation and Systems, vol. 12, pp. 102-110, 2014, doi: 10.1007/s12555-013-9156-2.</w:t>
       </w:r>
     </w:p>
     <w:p>
@@ -2095,44 +2139,12 @@
         <w:pStyle w:val="BodyText"/>
       </w:pPr>
       <w:r>
-        <w:t xml:space="preserve">[7] "Assessing Link Quality in IEEE 802.11 Wireless Networks: Which Is the Right Metric?" in Proc. IEEE 19th International Symposium on Personal, Indoor and Mobile Radio Communications (PIMRC), 2008, doi: 10.1109/PIMRC.2008.4699837.</w:t>
-      </w:r>
-    </w:p>
-    <w:p>
-      <w:pPr>
-        <w:pStyle w:val="BodyText"/>
-      </w:pPr>
-      <w:r>
-        <w:t xml:space="preserve">[8] "Revisiting Link Quality Metrics for Wireless Sensor Networks," in Proc. 2019 IEEE 5th International Conference on Computer and Communications (ICCC), 2019, doi: 10.1109/ICCC47050.2019.9064098.</w:t>
-      </w:r>
-    </w:p>
-    <w:p>
-      <w:pPr>
-        <w:pStyle w:val="BodyText"/>
-      </w:pPr>
-      <w:r>
-        <w:t xml:space="preserve">[9] "Faster or Slower: Convergence of Link Quality Metrics in Wireless Sensor Networks," in Proc. 2020 IEEE 6th International Conference on Computer and Communications (ICCC), 2020, doi: 10.1109/ICCC51575.2020.9345076.</w:t>
-      </w:r>
-    </w:p>
-    <w:p>
-      <w:pPr>
-        <w:pStyle w:val="BodyText"/>
-      </w:pPr>
-      <w:r>
-        <w:t xml:space="preserve">[10] J. Dong and W.-J. Kim, "Experimental Analysis and Implementation of a Multiscale Wireless/Wired Networked Control System," International Journal of Control, Automation and Systems, vol. 12, pp. 102-110, 2014, doi: 10.1007/s12555-013-9156-2.</w:t>
-      </w:r>
-    </w:p>
-    <w:p>
-      <w:pPr>
-        <w:pStyle w:val="BodyText"/>
-      </w:pPr>
-      <w:r>
         <w:t xml:space="preserve">[11] OpenAI, "ChatGPT," OpenAI, 2026. [Online]. Available:</w:t>
       </w:r>
       <w:r>
         <w:t xml:space="preserve"> </w:t>
       </w:r>
-      <w:hyperlink r:id="rId81">
+      <w:hyperlink r:id="rId82">
         <w:r>
           <w:rPr>
             <w:rStyle w:val="Hyperlink"/>
@@ -2141,8 +2153,8 @@
         </w:r>
       </w:hyperlink>
     </w:p>
-    <w:bookmarkEnd w:id="82"/>
-    <w:bookmarkStart w:id="83" w:name="_5433f13e7d2c963387f8684a00280e94d7d1692"/>
+    <w:bookmarkEnd w:id="83"/>
+    <w:bookmarkStart w:id="84" w:name="_5433f13e7d2c963387f8684a00280e94d7d1692"/>
     <w:p>
       <w:pPr>
         <w:pStyle w:val="Heading2"/>
@@ -2169,8 +2181,8 @@
         <w:t xml:space="preserve">IEEE Access requires short biographies for all authors. The current repository manuscript does not contain verified biographical text for the six authors, so placeholders are intentionally not fabricated in this review build.</w:t>
       </w:r>
     </w:p>
-    <w:bookmarkEnd w:id="83"/>
     <w:bookmarkEnd w:id="84"/>
+    <w:bookmarkEnd w:id="85"/>
     <w:sectPr>
       <w:headerReference r:id="rId9" w:type="default"/>
       <w:footerReference r:id="rId10" w:type="default"/>

</xml_diff>